<commit_message>
TB 3.1-3.6 Tamil final loaded
</commit_message>
<xml_diff>
--- a/brAhmaNa/TB 3.1-3.6 Tamil Corrections.docx
+++ b/brAhmaNa/TB 3.1-3.6 Tamil Corrections.docx
@@ -9,9 +9,6 @@
         <w:rPr>
           <w:b/>
           <w:bCs/>
-          <w:sz w:val="28"/>
-          <w:szCs w:val="32"/>
-          <w:u w:val="single"/>
         </w:rPr>
       </w:pPr>
       <w:r>
@@ -50,20 +47,24 @@
           <w:bCs/>
           <w:sz w:val="28"/>
           <w:szCs w:val="32"/>
-          <w:highlight w:val="red"/>
           <w:u w:val="single"/>
         </w:rPr>
-        <w:t>?????</w:t>
+        <w:t>28th  Feb 2026</w:t>
       </w:r>
-    </w:p>
-    <w:p>
-      <w:pPr>
-        <w:jc w:val="center"/>
+      <w:r>
         <w:rPr>
           <w:b/>
           <w:bCs/>
         </w:rPr>
-      </w:pPr>
+        <w:t xml:space="preserve"> </w:t>
+      </w:r>
+      <w:r>
+        <w:rPr>
+          <w:b/>
+          <w:bCs/>
+        </w:rPr>
+        <w:br/>
+      </w:r>
       <w:r>
         <w:rPr>
           <w:b/>
@@ -109,12 +110,16 @@
               <w:spacing w:before="0" w:line="240" w:lineRule="auto"/>
               <w:jc w:val="center"/>
               <w:rPr>
+                <w:b/>
+                <w:bCs/>
                 <w:sz w:val="32"/>
                 <w:szCs w:val="32"/>
               </w:rPr>
             </w:pPr>
             <w:r>
               <w:rPr>
+                <w:b/>
+                <w:bCs/>
                 <w:sz w:val="32"/>
                 <w:szCs w:val="32"/>
               </w:rPr>
@@ -126,12 +131,16 @@
               <w:spacing w:before="0" w:line="240" w:lineRule="auto"/>
               <w:jc w:val="center"/>
               <w:rPr>
+                <w:b/>
+                <w:bCs/>
                 <w:sz w:val="32"/>
                 <w:szCs w:val="32"/>
               </w:rPr>
             </w:pPr>
             <w:r>
               <w:rPr>
+                <w:b/>
+                <w:bCs/>
                 <w:sz w:val="32"/>
                 <w:szCs w:val="32"/>
               </w:rPr>
@@ -148,12 +157,16 @@
               <w:spacing w:before="0" w:line="240" w:lineRule="auto"/>
               <w:jc w:val="center"/>
               <w:rPr>
+                <w:b/>
+                <w:bCs/>
                 <w:sz w:val="32"/>
                 <w:szCs w:val="32"/>
               </w:rPr>
             </w:pPr>
             <w:r>
               <w:rPr>
+                <w:b/>
+                <w:bCs/>
                 <w:sz w:val="32"/>
                 <w:szCs w:val="32"/>
               </w:rPr>
@@ -171,12 +184,16 @@
               <w:ind w:right="-18"/>
               <w:jc w:val="center"/>
               <w:rPr>
+                <w:b/>
+                <w:bCs/>
                 <w:sz w:val="32"/>
                 <w:szCs w:val="32"/>
               </w:rPr>
             </w:pPr>
             <w:r>
               <w:rPr>
+                <w:b/>
+                <w:bCs/>
                 <w:sz w:val="32"/>
                 <w:szCs w:val="32"/>
               </w:rPr>
@@ -189,12 +206,16 @@
               <w:ind w:right="-18"/>
               <w:jc w:val="center"/>
               <w:rPr>
+                <w:b/>
+                <w:bCs/>
                 <w:sz w:val="32"/>
                 <w:szCs w:val="32"/>
               </w:rPr>
             </w:pPr>
             <w:r>
               <w:rPr>
+                <w:b/>
+                <w:bCs/>
                 <w:sz w:val="32"/>
                 <w:szCs w:val="32"/>
               </w:rPr>
@@ -10837,8 +10858,7 @@
     </w:p>
     <w:p>
       <w:pPr>
-        <w:spacing w:before="0"/>
-        <w:jc w:val="center"/>
+        <w:spacing w:before="0" w:line="240" w:lineRule="auto"/>
         <w:rPr>
           <w:b/>
           <w:bCs/>
@@ -10848,6 +10868,17 @@
           <w:lang w:val="it-IT"/>
         </w:rPr>
       </w:pPr>
+      <w:r>
+        <w:rPr>
+          <w:b/>
+          <w:bCs/>
+          <w:sz w:val="32"/>
+          <w:szCs w:val="32"/>
+          <w:u w:val="single"/>
+          <w:lang w:val="it-IT"/>
+        </w:rPr>
+        <w:br w:type="page"/>
+      </w:r>
     </w:p>
     <w:p>
       <w:pPr>
@@ -10869,6 +10900,7 @@
           <w:szCs w:val="32"/>
           <w:u w:val="single"/>
         </w:rPr>
+        <w:lastRenderedPageBreak/>
         <w:t xml:space="preserve">TaittirIya BrAhmaNam TB </w:t>
       </w:r>
       <w:r>
@@ -11244,7 +11276,6 @@
                 <w:sz w:val="28"/>
                 <w:szCs w:val="28"/>
               </w:rPr>
-              <w:lastRenderedPageBreak/>
               <w:t>TB 3.1.1.5</w:t>
             </w:r>
           </w:p>
@@ -13892,6 +13923,7 @@
                 <w:sz w:val="28"/>
                 <w:szCs w:val="28"/>
               </w:rPr>
+              <w:lastRenderedPageBreak/>
               <w:t>TB 3.1.6.1</w:t>
             </w:r>
           </w:p>
@@ -14637,7 +14669,6 @@
                 <w:sz w:val="28"/>
                 <w:szCs w:val="28"/>
               </w:rPr>
-              <w:lastRenderedPageBreak/>
               <w:t>TB 3.2.5.4</w:t>
             </w:r>
           </w:p>
@@ -16967,6 +16998,7 @@
                 <w:sz w:val="28"/>
                 <w:szCs w:val="28"/>
               </w:rPr>
+              <w:lastRenderedPageBreak/>
               <w:t>TB 3.3.7.3</w:t>
             </w:r>
           </w:p>
@@ -17701,7 +17733,6 @@
                 <w:sz w:val="28"/>
                 <w:szCs w:val="28"/>
               </w:rPr>
-              <w:lastRenderedPageBreak/>
               <w:t>TB 3.6.2.2</w:t>
             </w:r>
           </w:p>
@@ -19005,6 +19036,13 @@
         <w:b/>
         <w:bCs/>
       </w:rPr>
+      <w:t xml:space="preserve">            </w:t>
+    </w:r>
+    <w:r>
+      <w:rPr>
+        <w:b/>
+        <w:bCs/>
+      </w:rPr>
       <w:tab/>
       <w:t xml:space="preserve"> </w:t>
     </w:r>
@@ -19194,6 +19232,19 @@
         <w:bCs/>
       </w:rPr>
       <w:tab/>
+    </w:r>
+    <w:r>
+      <w:rPr>
+        <w:b/>
+        <w:bCs/>
+      </w:rPr>
+      <w:t xml:space="preserve">           </w:t>
+    </w:r>
+    <w:r>
+      <w:rPr>
+        <w:b/>
+        <w:bCs/>
+      </w:rPr>
       <w:t xml:space="preserve"> </w:t>
     </w:r>
     <w:r>

</xml_diff>